<commit_message>
Aggiornamento Tool NC - versione finale
</commit_message>
<xml_diff>
--- a/LCTool_NC/README_esperti_NC.docx
+++ b/LCTool_NC/README_esperti_NC.docx
@@ -256,12 +256,6 @@
         <w:gridCol w:w="6910"/>
       </w:tblGrid>
       <w:tr>
-        <w:tblPrEx>
-          <w:tblCellMar>
-            <w:top w:w="0" w:type="dxa"/>
-            <w:bottom w:w="0" w:type="dxa"/>
-          </w:tblCellMar>
-        </w:tblPrEx>
         <w:tc>
           <w:tcPr>
             <w:tcW w:w="3200" w:type="dxa"/>
@@ -336,12 +330,6 @@
         </w:tc>
       </w:tr>
       <w:tr>
-        <w:tblPrEx>
-          <w:tblCellMar>
-            <w:top w:w="0" w:type="dxa"/>
-            <w:bottom w:w="0" w:type="dxa"/>
-          </w:tblCellMar>
-        </w:tblPrEx>
         <w:tc>
           <w:tcPr>
             <w:tcW w:w="3200" w:type="dxa"/>
@@ -412,12 +400,6 @@
         </w:tc>
       </w:tr>
       <w:tr>
-        <w:tblPrEx>
-          <w:tblCellMar>
-            <w:top w:w="0" w:type="dxa"/>
-            <w:bottom w:w="0" w:type="dxa"/>
-          </w:tblCellMar>
-        </w:tblPrEx>
         <w:tc>
           <w:tcPr>
             <w:tcW w:w="3200" w:type="dxa"/>
@@ -488,12 +470,6 @@
         </w:tc>
       </w:tr>
       <w:tr>
-        <w:tblPrEx>
-          <w:tblCellMar>
-            <w:top w:w="0" w:type="dxa"/>
-            <w:bottom w:w="0" w:type="dxa"/>
-          </w:tblCellMar>
-        </w:tblPrEx>
         <w:tc>
           <w:tcPr>
             <w:tcW w:w="3200" w:type="dxa"/>
@@ -564,12 +540,6 @@
         </w:tc>
       </w:tr>
       <w:tr>
-        <w:tblPrEx>
-          <w:tblCellMar>
-            <w:top w:w="0" w:type="dxa"/>
-            <w:bottom w:w="0" w:type="dxa"/>
-          </w:tblCellMar>
-        </w:tblPrEx>
         <w:tc>
           <w:tcPr>
             <w:tcW w:w="3200" w:type="dxa"/>
@@ -640,12 +610,6 @@
         </w:tc>
       </w:tr>
       <w:tr>
-        <w:tblPrEx>
-          <w:tblCellMar>
-            <w:top w:w="0" w:type="dxa"/>
-            <w:bottom w:w="0" w:type="dxa"/>
-          </w:tblCellMar>
-        </w:tblPrEx>
         <w:tc>
           <w:tcPr>
             <w:tcW w:w="3200" w:type="dxa"/>
@@ -716,12 +680,6 @@
         </w:tc>
       </w:tr>
       <w:tr>
-        <w:tblPrEx>
-          <w:tblCellMar>
-            <w:top w:w="0" w:type="dxa"/>
-            <w:bottom w:w="0" w:type="dxa"/>
-          </w:tblCellMar>
-        </w:tblPrEx>
         <w:tc>
           <w:tcPr>
             <w:tcW w:w="3200" w:type="dxa"/>
@@ -792,12 +750,6 @@
         </w:tc>
       </w:tr>
       <w:tr>
-        <w:tblPrEx>
-          <w:tblCellMar>
-            <w:top w:w="0" w:type="dxa"/>
-            <w:bottom w:w="0" w:type="dxa"/>
-          </w:tblCellMar>
-        </w:tblPrEx>
         <w:tc>
           <w:tcPr>
             <w:tcW w:w="3200" w:type="dxa"/>
@@ -868,12 +820,6 @@
         </w:tc>
       </w:tr>
       <w:tr>
-        <w:tblPrEx>
-          <w:tblCellMar>
-            <w:top w:w="0" w:type="dxa"/>
-            <w:bottom w:w="0" w:type="dxa"/>
-          </w:tblCellMar>
-        </w:tblPrEx>
         <w:tc>
           <w:tcPr>
             <w:tcW w:w="3200" w:type="dxa"/>
@@ -945,12 +891,6 @@
         </w:tc>
       </w:tr>
       <w:tr>
-        <w:tblPrEx>
-          <w:tblCellMar>
-            <w:top w:w="0" w:type="dxa"/>
-            <w:bottom w:w="0" w:type="dxa"/>
-          </w:tblCellMar>
-        </w:tblPrEx>
         <w:tc>
           <w:tcPr>
             <w:tcW w:w="3200" w:type="dxa"/>
@@ -1030,6 +970,7 @@
             <w:r>
               <w:rPr>
                 <w:rFonts w:ascii="Times New Roman" w:hAnsi="Times New Roman" w:cs="Times New Roman"/>
+                <w:noProof/>
               </w:rPr>
               <w:lastRenderedPageBreak/>
               <w:drawing>
@@ -1071,6 +1012,7 @@
             <w:r>
               <w:rPr>
                 <w:rFonts w:ascii="Times New Roman" w:hAnsi="Times New Roman" w:cs="Times New Roman"/>
+                <w:noProof/>
               </w:rPr>
               <w:lastRenderedPageBreak/>
               <w:drawing>
@@ -1112,6 +1054,7 @@
             <w:r>
               <w:rPr>
                 <w:rFonts w:ascii="Times New Roman" w:hAnsi="Times New Roman" w:cs="Times New Roman"/>
+                <w:noProof/>
               </w:rPr>
               <w:lastRenderedPageBreak/>
               <w:drawing>
@@ -1337,12 +1280,6 @@
         <w:gridCol w:w="8863"/>
       </w:tblGrid>
       <w:tr>
-        <w:tblPrEx>
-          <w:tblCellMar>
-            <w:top w:w="0" w:type="dxa"/>
-            <w:bottom w:w="0" w:type="dxa"/>
-          </w:tblCellMar>
-        </w:tblPrEx>
         <w:tc>
           <w:tcPr>
             <w:tcW w:w="3200" w:type="dxa"/>
@@ -1417,12 +1354,6 @@
         </w:tc>
       </w:tr>
       <w:tr>
-        <w:tblPrEx>
-          <w:tblCellMar>
-            <w:top w:w="0" w:type="dxa"/>
-            <w:bottom w:w="0" w:type="dxa"/>
-          </w:tblCellMar>
-        </w:tblPrEx>
         <w:tc>
           <w:tcPr>
             <w:tcW w:w="3200" w:type="dxa"/>
@@ -1493,12 +1424,6 @@
         </w:tc>
       </w:tr>
       <w:tr>
-        <w:tblPrEx>
-          <w:tblCellMar>
-            <w:top w:w="0" w:type="dxa"/>
-            <w:bottom w:w="0" w:type="dxa"/>
-          </w:tblCellMar>
-        </w:tblPrEx>
         <w:tc>
           <w:tcPr>
             <w:tcW w:w="3200" w:type="dxa"/>
@@ -1569,12 +1494,6 @@
         </w:tc>
       </w:tr>
       <w:tr>
-        <w:tblPrEx>
-          <w:tblCellMar>
-            <w:top w:w="0" w:type="dxa"/>
-            <w:bottom w:w="0" w:type="dxa"/>
-          </w:tblCellMar>
-        </w:tblPrEx>
         <w:tc>
           <w:tcPr>
             <w:tcW w:w="3200" w:type="dxa"/>
@@ -1646,12 +1565,6 @@
         </w:tc>
       </w:tr>
       <w:tr>
-        <w:tblPrEx>
-          <w:tblCellMar>
-            <w:top w:w="0" w:type="dxa"/>
-            <w:bottom w:w="0" w:type="dxa"/>
-          </w:tblCellMar>
-        </w:tblPrEx>
         <w:tc>
           <w:tcPr>
             <w:tcW w:w="3200" w:type="dxa"/>
@@ -1722,12 +1635,6 @@
         </w:tc>
       </w:tr>
       <w:tr>
-        <w:tblPrEx>
-          <w:tblCellMar>
-            <w:top w:w="0" w:type="dxa"/>
-            <w:bottom w:w="0" w:type="dxa"/>
-          </w:tblCellMar>
-        </w:tblPrEx>
         <w:tc>
           <w:tcPr>
             <w:tcW w:w="3200" w:type="dxa"/>
@@ -1798,12 +1705,6 @@
         </w:tc>
       </w:tr>
       <w:tr>
-        <w:tblPrEx>
-          <w:tblCellMar>
-            <w:top w:w="0" w:type="dxa"/>
-            <w:bottom w:w="0" w:type="dxa"/>
-          </w:tblCellMar>
-        </w:tblPrEx>
         <w:tc>
           <w:tcPr>
             <w:tcW w:w="3200" w:type="dxa"/>
@@ -1874,12 +1775,6 @@
         </w:tc>
       </w:tr>
       <w:tr>
-        <w:tblPrEx>
-          <w:tblCellMar>
-            <w:top w:w="0" w:type="dxa"/>
-            <w:bottom w:w="0" w:type="dxa"/>
-          </w:tblCellMar>
-        </w:tblPrEx>
         <w:tc>
           <w:tcPr>
             <w:tcW w:w="3200" w:type="dxa"/>
@@ -1950,12 +1845,6 @@
         </w:tc>
       </w:tr>
       <w:tr>
-        <w:tblPrEx>
-          <w:tblCellMar>
-            <w:top w:w="0" w:type="dxa"/>
-            <w:bottom w:w="0" w:type="dxa"/>
-          </w:tblCellMar>
-        </w:tblPrEx>
         <w:tc>
           <w:tcPr>
             <w:tcW w:w="3200" w:type="dxa"/>
@@ -2026,12 +1915,6 @@
         </w:tc>
       </w:tr>
       <w:tr>
-        <w:tblPrEx>
-          <w:tblCellMar>
-            <w:top w:w="0" w:type="dxa"/>
-            <w:bottom w:w="0" w:type="dxa"/>
-          </w:tblCellMar>
-        </w:tblPrEx>
         <w:tc>
           <w:tcPr>
             <w:tcW w:w="3200" w:type="dxa"/>
@@ -3064,7 +2947,7 @@
           <w:noProof/>
         </w:rPr>
         <w:drawing>
-          <wp:inline distT="0" distB="0" distL="0" distR="0" wp14:anchorId="5C305EAF" wp14:editId="46775453">
+          <wp:inline distT="0" distB="0" distL="0" distR="0" wp14:anchorId="5C305EAF" wp14:editId="3249717F">
             <wp:extent cx="5731510" cy="2128520"/>
             <wp:effectExtent l="0" t="0" r="2540" b="5080"/>
             <wp:docPr id="1838109719" name="Immagine 6"/>
@@ -3135,17 +3018,15 @@
         <w:t>Archivio Non Conformità</w:t>
       </w:r>
       <w:r>
-        <w:t xml:space="preserve"> </w:t>
-      </w:r>
-      <w:r>
-        <w:rPr>
-          <w:noProof/>
+        <w:rPr>
+          <w:rFonts w:ascii="Times New Roman" w:eastAsia="Courier New" w:hAnsi="Times New Roman" w:cs="Times New Roman"/>
+          <w:color w:val="215E99" w:themeColor="text2" w:themeTint="BF"/>
         </w:rPr>
         <w:drawing>
-          <wp:inline distT="0" distB="0" distL="0" distR="0" wp14:anchorId="2E2E9280" wp14:editId="3E35C6E0">
-            <wp:extent cx="5731510" cy="4540885"/>
-            <wp:effectExtent l="0" t="0" r="2540" b="0"/>
-            <wp:docPr id="800861991" name="Immagine 7"/>
+          <wp:inline distT="0" distB="0" distL="0" distR="0" wp14:anchorId="32DE27A7" wp14:editId="0B0AA430">
+            <wp:extent cx="5731510" cy="4681220"/>
+            <wp:effectExtent l="0" t="0" r="2540" b="5080"/>
+            <wp:docPr id="161464610" name="Immagine 1"/>
             <wp:cNvGraphicFramePr>
               <a:graphicFrameLocks xmlns:a="http://schemas.openxmlformats.org/drawingml/2006/main" noChangeAspect="1"/>
             </wp:cNvGraphicFramePr>
@@ -3153,42 +3034,318 @@
               <a:graphicData uri="http://schemas.openxmlformats.org/drawingml/2006/picture">
                 <pic:pic xmlns:pic="http://schemas.openxmlformats.org/drawingml/2006/picture">
                   <pic:nvPicPr>
-                    <pic:cNvPr id="0" name="Picture 12"/>
-                    <pic:cNvPicPr>
-                      <a:picLocks noChangeAspect="1" noChangeArrowheads="1"/>
-                    </pic:cNvPicPr>
+                    <pic:cNvPr id="161464610" name=""/>
+                    <pic:cNvPicPr/>
                   </pic:nvPicPr>
                   <pic:blipFill>
-                    <a:blip r:embed="rId14">
-                      <a:extLst>
-                        <a:ext uri="{28A0092B-C50C-407E-A947-70E740481C1C}">
-                          <a14:useLocalDpi xmlns:a14="http://schemas.microsoft.com/office/drawing/2010/main" val="0"/>
-                        </a:ext>
-                      </a:extLst>
-                    </a:blip>
-                    <a:srcRect/>
+                    <a:blip r:embed="rId14"/>
                     <a:stretch>
                       <a:fillRect/>
                     </a:stretch>
                   </pic:blipFill>
-                  <pic:spPr bwMode="auto">
+                  <pic:spPr>
                     <a:xfrm>
                       <a:off x="0" y="0"/>
-                      <a:ext cx="5731510" cy="4540885"/>
+                      <a:ext cx="5731510" cy="4681220"/>
                     </a:xfrm>
                     <a:prstGeom prst="rect">
                       <a:avLst/>
                     </a:prstGeom>
-                    <a:noFill/>
-                    <a:ln>
-                      <a:noFill/>
-                    </a:ln>
                   </pic:spPr>
                 </pic:pic>
               </a:graphicData>
             </a:graphic>
           </wp:inline>
         </w:drawing>
+      </w:r>
+      <w:r>
+        <w:rPr>
+          <w:rFonts w:ascii="Times New Roman" w:eastAsia="Courier New" w:hAnsi="Times New Roman" w:cs="Times New Roman"/>
+          <w:noProof/>
+          <w:color w:val="215E99" w:themeColor="text2" w:themeTint="BF"/>
+        </w:rPr>
+        <mc:AlternateContent>
+          <mc:Choice Requires="wps">
+            <w:drawing>
+              <wp:inline distT="0" distB="0" distL="0" distR="0" wp14:anchorId="43ECA8DE" wp14:editId="1B6671E4">
+                <wp:extent cx="304800" cy="304800"/>
+                <wp:effectExtent l="0" t="0" r="0" b="0"/>
+                <wp:docPr id="1405692055" name="Rettangolo 5"/>
+                <wp:cNvGraphicFramePr>
+                  <a:graphicFrameLocks xmlns:a="http://schemas.openxmlformats.org/drawingml/2006/main" noChangeAspect="1"/>
+                </wp:cNvGraphicFramePr>
+                <a:graphic xmlns:a="http://schemas.openxmlformats.org/drawingml/2006/main">
+                  <a:graphicData uri="http://schemas.microsoft.com/office/word/2010/wordprocessingShape">
+                    <wps:wsp>
+                      <wps:cNvSpPr>
+                        <a:spLocks noChangeAspect="1" noChangeArrowheads="1"/>
+                      </wps:cNvSpPr>
+                      <wps:spPr bwMode="auto">
+                        <a:xfrm>
+                          <a:off x="0" y="0"/>
+                          <a:ext cx="304800" cy="304800"/>
+                        </a:xfrm>
+                        <a:prstGeom prst="rect">
+                          <a:avLst/>
+                        </a:prstGeom>
+                        <a:noFill/>
+                        <a:ln>
+                          <a:noFill/>
+                        </a:ln>
+                        <a:extLst>
+                          <a:ext uri="{909E8E84-426E-40DD-AFC4-6F175D3DCCD1}">
+                            <a14:hiddenFill xmlns:a14="http://schemas.microsoft.com/office/drawing/2010/main">
+                              <a:solidFill>
+                                <a:srgbClr val="FFFFFF"/>
+                              </a:solidFill>
+                            </a14:hiddenFill>
+                          </a:ext>
+                          <a:ext uri="{91240B29-F687-4F45-9708-019B960494DF}">
+                            <a14:hiddenLine xmlns:a14="http://schemas.microsoft.com/office/drawing/2010/main" w="9525">
+                              <a:solidFill>
+                                <a:srgbClr val="000000"/>
+                              </a:solidFill>
+                              <a:miter lim="800000"/>
+                              <a:headEnd/>
+                              <a:tailEnd/>
+                            </a14:hiddenLine>
+                          </a:ext>
+                        </a:extLst>
+                      </wps:spPr>
+                      <wps:bodyPr rot="0" vert="horz" wrap="square" lIns="91440" tIns="45720" rIns="91440" bIns="45720" anchor="t" anchorCtr="0" upright="1">
+                        <a:noAutofit/>
+                      </wps:bodyPr>
+                    </wps:wsp>
+                  </a:graphicData>
+                </a:graphic>
+              </wp:inline>
+            </w:drawing>
+          </mc:Choice>
+          <mc:Fallback>
+            <w:pict>
+              <v:rect w14:anchorId="509153CD" id="Rettangolo 5" o:spid="_x0000_s1026" style="width:24pt;height:24pt;visibility:visible;mso-wrap-style:square;mso-left-percent:-10001;mso-top-percent:-10001;mso-position-horizontal:absolute;mso-position-horizontal-relative:char;mso-position-vertical:absolute;mso-position-vertical-relative:line;mso-left-percent:-10001;mso-top-percent:-10001;v-text-anchor:top" o:gfxdata="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" filled="f" stroked="f">
+                <o:lock v:ext="edit" aspectratio="t"/>
+                <w10:anchorlock/>
+              </v:rect>
+            </w:pict>
+          </mc:Fallback>
+        </mc:AlternateContent>
+      </w:r>
+      <w:r>
+        <w:rPr>
+          <w:noProof/>
+        </w:rPr>
+        <mc:AlternateContent>
+          <mc:Choice Requires="wps">
+            <w:drawing>
+              <wp:inline distT="0" distB="0" distL="0" distR="0" wp14:anchorId="08561F4A" wp14:editId="6AFB0437">
+                <wp:extent cx="304800" cy="304800"/>
+                <wp:effectExtent l="0" t="0" r="0" b="0"/>
+                <wp:docPr id="1745169515" name="AutoShape 11"/>
+                <wp:cNvGraphicFramePr>
+                  <a:graphicFrameLocks xmlns:a="http://schemas.openxmlformats.org/drawingml/2006/main" noChangeAspect="1"/>
+                </wp:cNvGraphicFramePr>
+                <a:graphic xmlns:a="http://schemas.openxmlformats.org/drawingml/2006/main">
+                  <a:graphicData uri="http://schemas.microsoft.com/office/word/2010/wordprocessingShape">
+                    <wps:wsp>
+                      <wps:cNvSpPr>
+                        <a:spLocks noChangeAspect="1" noChangeArrowheads="1"/>
+                      </wps:cNvSpPr>
+                      <wps:spPr bwMode="auto">
+                        <a:xfrm>
+                          <a:off x="0" y="0"/>
+                          <a:ext cx="304800" cy="304800"/>
+                        </a:xfrm>
+                        <a:prstGeom prst="rect">
+                          <a:avLst/>
+                        </a:prstGeom>
+                        <a:noFill/>
+                        <a:ln>
+                          <a:noFill/>
+                        </a:ln>
+                        <a:extLst>
+                          <a:ext uri="{909E8E84-426E-40DD-AFC4-6F175D3DCCD1}">
+                            <a14:hiddenFill xmlns:a14="http://schemas.microsoft.com/office/drawing/2010/main">
+                              <a:solidFill>
+                                <a:srgbClr val="FFFFFF"/>
+                              </a:solidFill>
+                            </a14:hiddenFill>
+                          </a:ext>
+                          <a:ext uri="{91240B29-F687-4F45-9708-019B960494DF}">
+                            <a14:hiddenLine xmlns:a14="http://schemas.microsoft.com/office/drawing/2010/main" w="9525">
+                              <a:solidFill>
+                                <a:srgbClr val="000000"/>
+                              </a:solidFill>
+                              <a:miter lim="800000"/>
+                              <a:headEnd/>
+                              <a:tailEnd/>
+                            </a14:hiddenLine>
+                          </a:ext>
+                        </a:extLst>
+                      </wps:spPr>
+                      <wps:bodyPr rot="0" vert="horz" wrap="square" lIns="91440" tIns="45720" rIns="91440" bIns="45720" anchor="t" anchorCtr="0" upright="1">
+                        <a:noAutofit/>
+                      </wps:bodyPr>
+                    </wps:wsp>
+                  </a:graphicData>
+                </a:graphic>
+              </wp:inline>
+            </w:drawing>
+          </mc:Choice>
+          <mc:Fallback>
+            <w:pict>
+              <v:rect w14:anchorId="2C9A9402" id="AutoShape 11" o:spid="_x0000_s1026" style="width:24pt;height:24pt;visibility:visible;mso-wrap-style:square;mso-left-percent:-10001;mso-top-percent:-10001;mso-position-horizontal:absolute;mso-position-horizontal-relative:char;mso-position-vertical:absolute;mso-position-vertical-relative:line;mso-left-percent:-10001;mso-top-percent:-10001;v-text-anchor:top" o:gfxdata="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" filled="f" stroked="f">
+                <o:lock v:ext="edit" aspectratio="t"/>
+                <w10:anchorlock/>
+              </v:rect>
+            </w:pict>
+          </mc:Fallback>
+        </mc:AlternateContent>
+      </w:r>
+      <w:r>
+        <w:t xml:space="preserve"> </w:t>
+      </w:r>
+      <w:r>
+        <w:rPr>
+          <w:noProof/>
+        </w:rPr>
+        <mc:AlternateContent>
+          <mc:Choice Requires="wps">
+            <w:drawing>
+              <wp:inline distT="0" distB="0" distL="0" distR="0" wp14:anchorId="29DF8693" wp14:editId="03B6C903">
+                <wp:extent cx="304800" cy="304800"/>
+                <wp:effectExtent l="0" t="0" r="0" b="0"/>
+                <wp:docPr id="1682972410" name="Rettangolo 1"/>
+                <wp:cNvGraphicFramePr>
+                  <a:graphicFrameLocks xmlns:a="http://schemas.openxmlformats.org/drawingml/2006/main" noChangeAspect="1"/>
+                </wp:cNvGraphicFramePr>
+                <a:graphic xmlns:a="http://schemas.openxmlformats.org/drawingml/2006/main">
+                  <a:graphicData uri="http://schemas.microsoft.com/office/word/2010/wordprocessingShape">
+                    <wps:wsp>
+                      <wps:cNvSpPr>
+                        <a:spLocks noChangeAspect="1" noChangeArrowheads="1"/>
+                      </wps:cNvSpPr>
+                      <wps:spPr bwMode="auto">
+                        <a:xfrm>
+                          <a:off x="0" y="0"/>
+                          <a:ext cx="304800" cy="304800"/>
+                        </a:xfrm>
+                        <a:prstGeom prst="rect">
+                          <a:avLst/>
+                        </a:prstGeom>
+                        <a:noFill/>
+                        <a:ln>
+                          <a:noFill/>
+                        </a:ln>
+                        <a:extLst>
+                          <a:ext uri="{909E8E84-426E-40DD-AFC4-6F175D3DCCD1}">
+                            <a14:hiddenFill xmlns:a14="http://schemas.microsoft.com/office/drawing/2010/main">
+                              <a:solidFill>
+                                <a:srgbClr val="FFFFFF"/>
+                              </a:solidFill>
+                            </a14:hiddenFill>
+                          </a:ext>
+                          <a:ext uri="{91240B29-F687-4F45-9708-019B960494DF}">
+                            <a14:hiddenLine xmlns:a14="http://schemas.microsoft.com/office/drawing/2010/main" w="9525">
+                              <a:solidFill>
+                                <a:srgbClr val="000000"/>
+                              </a:solidFill>
+                              <a:miter lim="800000"/>
+                              <a:headEnd/>
+                              <a:tailEnd/>
+                            </a14:hiddenLine>
+                          </a:ext>
+                        </a:extLst>
+                      </wps:spPr>
+                      <wps:bodyPr rot="0" vert="horz" wrap="square" lIns="91440" tIns="45720" rIns="91440" bIns="45720" anchor="t" anchorCtr="0" upright="1">
+                        <a:noAutofit/>
+                      </wps:bodyPr>
+                    </wps:wsp>
+                  </a:graphicData>
+                </a:graphic>
+              </wp:inline>
+            </w:drawing>
+          </mc:Choice>
+          <mc:Fallback>
+            <w:pict>
+              <v:rect w14:anchorId="5B575351" id="Rettangolo 1" o:spid="_x0000_s1026" style="width:24pt;height:24pt;visibility:visible;mso-wrap-style:square;mso-left-percent:-10001;mso-top-percent:-10001;mso-position-horizontal:absolute;mso-position-horizontal-relative:char;mso-position-vertical:absolute;mso-position-vertical-relative:line;mso-left-percent:-10001;mso-top-percent:-10001;v-text-anchor:top" o:gfxdata="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" filled="f" stroked="f">
+                <o:lock v:ext="edit" aspectratio="t"/>
+                <w10:anchorlock/>
+              </v:rect>
+            </w:pict>
+          </mc:Fallback>
+        </mc:AlternateContent>
+      </w:r>
+      <w:r>
+        <w:rPr>
+          <w:noProof/>
+        </w:rPr>
+        <mc:AlternateContent>
+          <mc:Choice Requires="wps">
+            <w:drawing>
+              <wp:inline distT="0" distB="0" distL="0" distR="0" wp14:anchorId="6C3427F7" wp14:editId="0DFCB04A">
+                <wp:extent cx="304800" cy="304800"/>
+                <wp:effectExtent l="0" t="0" r="0" b="0"/>
+                <wp:docPr id="1128744886" name="Rettangolo 2"/>
+                <wp:cNvGraphicFramePr>
+                  <a:graphicFrameLocks xmlns:a="http://schemas.openxmlformats.org/drawingml/2006/main" noChangeAspect="1"/>
+                </wp:cNvGraphicFramePr>
+                <a:graphic xmlns:a="http://schemas.openxmlformats.org/drawingml/2006/main">
+                  <a:graphicData uri="http://schemas.microsoft.com/office/word/2010/wordprocessingShape">
+                    <wps:wsp>
+                      <wps:cNvSpPr>
+                        <a:spLocks noChangeAspect="1" noChangeArrowheads="1"/>
+                      </wps:cNvSpPr>
+                      <wps:spPr bwMode="auto">
+                        <a:xfrm>
+                          <a:off x="0" y="0"/>
+                          <a:ext cx="304800" cy="304800"/>
+                        </a:xfrm>
+                        <a:prstGeom prst="rect">
+                          <a:avLst/>
+                        </a:prstGeom>
+                        <a:noFill/>
+                        <a:ln>
+                          <a:noFill/>
+                        </a:ln>
+                        <a:extLst>
+                          <a:ext uri="{909E8E84-426E-40DD-AFC4-6F175D3DCCD1}">
+                            <a14:hiddenFill xmlns:a14="http://schemas.microsoft.com/office/drawing/2010/main">
+                              <a:solidFill>
+                                <a:srgbClr val="FFFFFF"/>
+                              </a:solidFill>
+                            </a14:hiddenFill>
+                          </a:ext>
+                          <a:ext uri="{91240B29-F687-4F45-9708-019B960494DF}">
+                            <a14:hiddenLine xmlns:a14="http://schemas.microsoft.com/office/drawing/2010/main" w="9525">
+                              <a:solidFill>
+                                <a:srgbClr val="000000"/>
+                              </a:solidFill>
+                              <a:miter lim="800000"/>
+                              <a:headEnd/>
+                              <a:tailEnd/>
+                            </a14:hiddenLine>
+                          </a:ext>
+                        </a:extLst>
+                      </wps:spPr>
+                      <wps:bodyPr rot="0" vert="horz" wrap="square" lIns="91440" tIns="45720" rIns="91440" bIns="45720" anchor="t" anchorCtr="0" upright="1">
+                        <a:noAutofit/>
+                      </wps:bodyPr>
+                    </wps:wsp>
+                  </a:graphicData>
+                </a:graphic>
+              </wp:inline>
+            </w:drawing>
+          </mc:Choice>
+          <mc:Fallback>
+            <w:pict>
+              <v:rect w14:anchorId="73C06569" id="Rettangolo 2" o:spid="_x0000_s1026" style="width:24pt;height:24pt;visibility:visible;mso-wrap-style:square;mso-left-percent:-10001;mso-top-percent:-10001;mso-position-horizontal:absolute;mso-position-horizontal-relative:char;mso-position-vertical:absolute;mso-position-vertical-relative:line;mso-left-percent:-10001;mso-top-percent:-10001;v-text-anchor:top" o:gfxdata="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" filled="f" stroked="f">
+                <o:lock v:ext="edit" aspectratio="t"/>
+                <w10:anchorlock/>
+              </v:rect>
+            </w:pict>
+          </mc:Fallback>
+        </mc:AlternateContent>
       </w:r>
     </w:p>
     <w:p>
@@ -4357,7 +4514,6 @@
   <w:style w:type="character" w:default="1" w:styleId="Carpredefinitoparagrafo">
     <w:name w:val="Default Paragraph Font"/>
     <w:uiPriority w:val="1"/>
-    <w:semiHidden/>
     <w:unhideWhenUsed/>
   </w:style>
   <w:style w:type="table" w:default="1" w:styleId="Tabellanormale">

</xml_diff>